<commit_message>
Revise Task 3 summary: correct Cursor split ratio, CV, and population filtering
Key corrections based on notebook evidence:
- Cursor uses 70/30 split (not 80/20) and does include 3-fold CV (ROC-AUC 0.8629±0.0025)
- Cursor drops both duplicates and 180 zero-adult rows, reducing population to ~87,011
- Table: Cursor verification row updated to reflect 3-fold CV inclusion
- Section 2.4 intro paragraph expanded with agent-specific factual summaries

https://claude.ai/code/session_01151RBTJw6umrjSf7LSiuhC
</commit_message>
<xml_diff>
--- a/report.docx
+++ b/report.docx
@@ -846,7 +846,192 @@
         <w:pStyle w:val="FirstParagraph"/>
       </w:pPr>
       <w:r>
-        <w:t xml:space="preserve">Task 3 tested whether the understanding developed in Tasks 1 and 2 could be translated into a statistically valid baseline workflow for predicting hotel booking cancellations. Each agent was required to define the prediction target, determine a leakage-safe feature scope, split the data before any preprocessing, select and justify a simple interpretable baseline model, report appropriate evaluation metrics, explain workflow weaknesses, and ensure full reproducibility. Model complexity was not rewarded; the task was designed to assess methodological soundness rather than optimised performance. The table below records the observed evidence from each agent’s notebook output.</w:t>
+        <w:t xml:space="preserve">Task 3 tested whether the understanding developed in Tasks 1 and 2 could be translated into a statistically valid baseline workflow for predicting hotel booking cancellations. Each agent was required to define the prediction target, determine a leakage-safe feature scope, split the data before any preprocessing, select and justify a simple interpretable baseline model, report appropriate evaluation metrics, explain workflow weaknesses, and ensure full reproducibility. Model complexity was not rewarded; the task was designed to assess methodological soundness rather than optimised performance.</w:t>
+      </w:r>
+    </w:p>
+    <w:p>
+      <w:pPr>
+        <w:pStyle w:val="BodyText"/>
+      </w:pPr>
+      <w:r>
+        <w:t xml:space="preserve">Claude Code produces the most audit-ready workflow. It applies a stratified 80/20 split (train: 95,512 rows; test: 23,878 rows), fits Logistic Regression (</w:t>
+      </w:r>
+      <w:r>
+        <w:rPr>
+          <w:rStyle w:val="VerbatimChar"/>
+        </w:rPr>
+        <w:t xml:space="preserve">class_weight='balanced'</w:t>
+      </w:r>
+      <w:r>
+        <w:t xml:space="preserve">, solver</w:t>
+      </w:r>
+      <w:r>
+        <w:t xml:space="preserve"> </w:t>
+      </w:r>
+      <w:r>
+        <w:rPr>
+          <w:rStyle w:val="VerbatimChar"/>
+        </w:rPr>
+        <w:t xml:space="preserve">lbfgs</w:t>
+      </w:r>
+      <w:r>
+        <w:t xml:space="preserve">) against a</w:t>
+      </w:r>
+      <w:r>
+        <w:t xml:space="preserve"> </w:t>
+      </w:r>
+      <w:r>
+        <w:rPr>
+          <w:rStyle w:val="VerbatimChar"/>
+        </w:rPr>
+        <w:t xml:space="preserve">DummyClassifier</w:t>
+      </w:r>
+      <w:r>
+        <w:t xml:space="preserve"> </w:t>
+      </w:r>
+      <w:r>
+        <w:t xml:space="preserve">lower bound, runs 5-fold stratified CV on the training set (ROC-AUC: 0.8313 ± 0.0039), and computes an explicit train-test gap (ROC-AUC gap: 0.003), confirming minimal overfitting. It also applies the most conservative feature scope, excluding</w:t>
+      </w:r>
+      <w:r>
+        <w:t xml:space="preserve"> </w:t>
+      </w:r>
+      <w:r>
+        <w:rPr>
+          <w:rStyle w:val="VerbatimChar"/>
+        </w:rPr>
+        <w:t xml:space="preserve">deposit_type</w:t>
+      </w:r>
+      <w:r>
+        <w:t xml:space="preserve">,</w:t>
+      </w:r>
+      <w:r>
+        <w:t xml:space="preserve"> </w:t>
+      </w:r>
+      <w:r>
+        <w:rPr>
+          <w:rStyle w:val="VerbatimChar"/>
+        </w:rPr>
+        <w:t xml:space="preserve">assigned_room_type</w:t>
+      </w:r>
+      <w:r>
+        <w:t xml:space="preserve">, and</w:t>
+      </w:r>
+      <w:r>
+        <w:t xml:space="preserve"> </w:t>
+      </w:r>
+      <w:r>
+        <w:rPr>
+          <w:rStyle w:val="VerbatimChar"/>
+        </w:rPr>
+        <w:t xml:space="preserve">booking_changes</w:t>
+      </w:r>
+      <w:r>
+        <w:t xml:space="preserve"> </w:t>
+      </w:r>
+      <w:r>
+        <w:t xml:space="preserve">on temporal-ambiguity grounds, and recodes</w:t>
+      </w:r>
+      <w:r>
+        <w:t xml:space="preserve"> </w:t>
+      </w:r>
+      <w:r>
+        <w:rPr>
+          <w:rStyle w:val="VerbatimChar"/>
+        </w:rPr>
+        <w:t xml:space="preserve">agent</w:t>
+      </w:r>
+      <w:r>
+        <w:t xml:space="preserve">/</w:t>
+      </w:r>
+      <w:r>
+        <w:rPr>
+          <w:rStyle w:val="VerbatimChar"/>
+        </w:rPr>
+        <w:t xml:space="preserve">company</w:t>
+      </w:r>
+      <w:r>
+        <w:t xml:space="preserve"> </w:t>
+      </w:r>
+      <w:r>
+        <w:t xml:space="preserve">as binary presence flags rather than dropping them. Test ROC-AUC: 0.8293.</w:t>
+      </w:r>
+    </w:p>
+    <w:p>
+      <w:pPr>
+        <w:pStyle w:val="BodyText"/>
+      </w:pPr>
+      <w:r>
+        <w:t xml:space="preserve">Codex adopts a chronological holdout split aligned with deployment logic (arrivals before 2017 as train: 78,703 rows; 2017 onwards as test: 40,687 rows), reflecting realistic temporal distribution shift (train cancel rate 36.2%; test 38.7%). Logistic Regression (</w:t>
+      </w:r>
+      <w:r>
+        <w:rPr>
+          <w:rStyle w:val="VerbatimChar"/>
+        </w:rPr>
+        <w:t xml:space="preserve">class_weight='balanced'</w:t>
+      </w:r>
+      <w:r>
+        <w:t xml:space="preserve">, solver</w:t>
+      </w:r>
+      <w:r>
+        <w:t xml:space="preserve"> </w:t>
+      </w:r>
+      <w:r>
+        <w:rPr>
+          <w:rStyle w:val="VerbatimChar"/>
+        </w:rPr>
+        <w:t xml:space="preserve">liblinear</w:t>
+      </w:r>
+      <w:r>
+        <w:t xml:space="preserve">) is trained on 29 features, retaining temporally ambiguous variables (</w:t>
+      </w:r>
+      <w:r>
+        <w:rPr>
+          <w:rStyle w:val="VerbatimChar"/>
+        </w:rPr>
+        <w:t xml:space="preserve">deposit_type</w:t>
+      </w:r>
+      <w:r>
+        <w:t xml:space="preserve">,</w:t>
+      </w:r>
+      <w:r>
+        <w:t xml:space="preserve"> </w:t>
+      </w:r>
+      <w:r>
+        <w:rPr>
+          <w:rStyle w:val="VerbatimChar"/>
+        </w:rPr>
+        <w:t xml:space="preserve">booking_changes</w:t>
+      </w:r>
+      <w:r>
+        <w:t xml:space="preserve">,</w:t>
+      </w:r>
+      <w:r>
+        <w:t xml:space="preserve"> </w:t>
+      </w:r>
+      <w:r>
+        <w:rPr>
+          <w:rStyle w:val="VerbatimChar"/>
+        </w:rPr>
+        <w:t xml:space="preserve">assigned_room_type</w:t>
+      </w:r>
+      <w:r>
+        <w:t xml:space="preserve">) without exclusion. It reports the broadest metric set of the three agents (ROC-AUC, PR-AUC, Balanced Accuracy, F1, Precision, Recall, Log Loss, Brier Score) and computes an explicit train-test gap (ROC-AUC gap: 0.0504). No dummy baseline or cross-validation is reported for the Task 3 baseline. Test ROC-AUC: 0.8794.</w:t>
+      </w:r>
+    </w:p>
+    <w:p>
+      <w:pPr>
+        <w:pStyle w:val="BodyText"/>
+      </w:pPr>
+      <w:r>
+        <w:t xml:space="preserve">Cursor produces a runnable Logistic Regression baseline on a stratified 70/30 split (train: 60,907 rows; test: 26,104 rows). Critically, it filters the dataset before splitting — removing exact duplicate rows and 180 zero-adult bookings — reducing the benchmark population from 119,390 to approximately 87,011 rows and shifting the observed cancellation rate from ~37% to ~27.5%. No class weighting is applied. A 3-fold stratified CV is run on the training set (ROC-AUC: 0.8629 ± 0.0025), but no dummy baseline and no explicit train-test overfitting gap diagnostic are included. The population alteration is not flagged as a deviation from the original benchmark population. Test ROC-AUC: 0.8668.</w:t>
+      </w:r>
+    </w:p>
+    <w:p>
+      <w:pPr>
+        <w:pStyle w:val="BodyText"/>
+      </w:pPr>
+      <w:r>
+        <w:t xml:space="preserve">Since manual review confirms that all three satisfy the defined success criteria (code runs without error, split precedes preprocessing, labelled metrics reported), these differences are retained as task-level benchmark evidence and examined comparatively in Section 3. The table below records the full observed evidence from each agent’s notebook output.</w:t>
       </w:r>
     </w:p>
     <w:tbl>
@@ -1693,7 +1878,7 @@
               <w:jc w:val="left"/>
             </w:pPr>
             <w:r>
-              <w:t xml:space="preserve">No CV, no dummy baseline, and no train-test overfitting diagnostic included.</w:t>
+              <w:t xml:space="preserve">3-fold stratified CV on training set (CV ROC-AUC: 0.8629 ± 0.0025). No dummy baseline and no explicit train-test overfitting gap diagnostic included.</w:t>
             </w:r>
           </w:p>
         </w:tc>

</xml_diff>

<commit_message>
Fix Cursor Task 3: remove incorrect CV claim (was from Task 4 candidate comparison)
https://claude.ai/code/session_01151RBTJw6umrjSf7LSiuhC
</commit_message>
<xml_diff>
--- a/report.docx
+++ b/report.docx
@@ -1023,7 +1023,7 @@
         <w:pStyle w:val="BodyText"/>
       </w:pPr>
       <w:r>
-        <w:t xml:space="preserve">Cursor produces a runnable Logistic Regression baseline on a stratified 70/30 split (train: 60,907 rows; test: 26,104 rows). Critically, it filters the dataset before splitting — removing exact duplicate rows and 180 zero-adult bookings — reducing the benchmark population from 119,390 to approximately 87,011 rows and shifting the observed cancellation rate from ~37% to ~27.5%. No class weighting is applied. A 3-fold stratified CV is run on the training set (ROC-AUC: 0.8629 ± 0.0025), but no dummy baseline and no explicit train-test overfitting gap diagnostic are included. The population alteration is not flagged as a deviation from the original benchmark population. Test ROC-AUC: 0.8668.</w:t>
+        <w:t xml:space="preserve">Cursor produces a runnable Logistic Regression baseline on a stratified 70/30 split (train: 60,907 rows; test: 26,104 rows). Critically, it filters the dataset before splitting — removing exact duplicate rows and 180 zero-adult bookings — reducing the benchmark population from 119,390 to approximately 87,011 rows and shifting the observed cancellation rate from ~37% to ~27.5%. No class weighting is applied. No cross-validation, no dummy baseline, and no train-test overfitting gap diagnostic are included. The population alteration is not flagged as a deviation from the original benchmark population. Test ROC-AUC: 0.8668.</w:t>
       </w:r>
     </w:p>
     <w:p>
@@ -1878,7 +1878,7 @@
               <w:jc w:val="left"/>
             </w:pPr>
             <w:r>
-              <w:t xml:space="preserve">3-fold stratified CV on training set (CV ROC-AUC: 0.8629 ± 0.0025). No dummy baseline and no explicit train-test overfitting gap diagnostic included.</w:t>
+              <w:t xml:space="preserve">No CV, no dummy baseline, and no train-test overfitting gap diagnostic included.</w:t>
             </w:r>
           </w:p>
         </w:tc>

</xml_diff>